<commit_message>
content: add lesson plans + Word files for 4 programming courses
Coding Kids (Algorithm): 12 topics — Robot, Sequence, Maze, Loop, If/Then,
  Compare, Pattern, Classification, Optimize, Debug, Decompose, Final Project

Scratch Kids: 12 topics — Intro, Motion, Events, Looks, Sound, Loop,
  Conditions, Variables, Coordinates, Clone, Full Game, Final Project

Python Lab: 12 topics — Hello, Variables, If/Else, Loop, Function,
  List/Dict, Random/Game, Turtle, Files, AI/Chatbot, Vision, Final Project

Algorithm Lab (C++): 15 topics — Basics, Conditions, Loop, Functions,
  Arrays, Sorting, STL, Greedy, Backtracking, BinSearch, Graph, DP,
  Contest Skills, Mock Contest, Final Project

Each topic: Markdown + Word (.docx) with lesson plan, code examples,
exercises, homework, AI coach tips, completion badge
</commit_message>
<xml_diff>
--- a/content/algorithm/docx/topic-01-robot-va-lenh.docx
+++ b/content/algorithm/docx/topic-01-robot-va-lenh.docx
@@ -2339,6 +2339,7 @@
     <w:link w:val="VerbatimChar"/>
     <w:pPr>
       <w:wordWrap w:val="off"/>
+      <w:shd w:val="clear" w:fill="f8f8f8"/>
     </w:pPr>
   </w:style>
   <w:style w:type="character" w:customStyle="1" w:styleId="KeywordTok">
@@ -2346,85 +2347,96 @@
     <w:basedOn w:val="VerbatimChar"/>
     <w:rPr>
       <w:b/>
-      <w:color w:val="007020"/>
+      <w:color w:val="204a87"/>
+      <w:shd w:val="clear" w:fill="f8f8f8"/>
     </w:rPr>
   </w:style>
   <w:style w:type="character" w:customStyle="1" w:styleId="DataTypeTok">
     <w:name w:val="DataTypeTok"/>
     <w:basedOn w:val="VerbatimChar"/>
     <w:rPr>
-      <w:color w:val="902000"/>
+      <w:color w:val="204a87"/>
+      <w:shd w:val="clear" w:fill="f8f8f8"/>
     </w:rPr>
   </w:style>
   <w:style w:type="character" w:customStyle="1" w:styleId="DecValTok">
     <w:name w:val="DecValTok"/>
     <w:basedOn w:val="VerbatimChar"/>
     <w:rPr>
-      <w:color w:val="40a070"/>
+      <w:color w:val="0000cf"/>
+      <w:shd w:val="clear" w:fill="f8f8f8"/>
     </w:rPr>
   </w:style>
   <w:style w:type="character" w:customStyle="1" w:styleId="BaseNTok">
     <w:name w:val="BaseNTok"/>
     <w:basedOn w:val="VerbatimChar"/>
     <w:rPr>
-      <w:color w:val="40a070"/>
+      <w:color w:val="0000cf"/>
+      <w:shd w:val="clear" w:fill="f8f8f8"/>
     </w:rPr>
   </w:style>
   <w:style w:type="character" w:customStyle="1" w:styleId="FloatTok">
     <w:name w:val="FloatTok"/>
     <w:basedOn w:val="VerbatimChar"/>
     <w:rPr>
-      <w:color w:val="40a070"/>
+      <w:color w:val="0000cf"/>
+      <w:shd w:val="clear" w:fill="f8f8f8"/>
     </w:rPr>
   </w:style>
   <w:style w:type="character" w:customStyle="1" w:styleId="ConstantTok">
     <w:name w:val="ConstantTok"/>
     <w:basedOn w:val="VerbatimChar"/>
     <w:rPr>
-      <w:color w:val="880000"/>
+      <w:color w:val="8f5902"/>
+      <w:shd w:val="clear" w:fill="f8f8f8"/>
     </w:rPr>
   </w:style>
   <w:style w:type="character" w:customStyle="1" w:styleId="CharTok">
     <w:name w:val="CharTok"/>
     <w:basedOn w:val="VerbatimChar"/>
     <w:rPr>
-      <w:color w:val="4070a0"/>
+      <w:color w:val="4e9a06"/>
+      <w:shd w:val="clear" w:fill="f8f8f8"/>
     </w:rPr>
   </w:style>
   <w:style w:type="character" w:customStyle="1" w:styleId="SpecialCharTok">
     <w:name w:val="SpecialCharTok"/>
     <w:basedOn w:val="VerbatimChar"/>
     <w:rPr>
-      <w:color w:val="4070a0"/>
+      <w:b/>
+      <w:color w:val="ce5c00"/>
+      <w:shd w:val="clear" w:fill="f8f8f8"/>
     </w:rPr>
   </w:style>
   <w:style w:type="character" w:customStyle="1" w:styleId="StringTok">
     <w:name w:val="StringTok"/>
     <w:basedOn w:val="VerbatimChar"/>
     <w:rPr>
-      <w:color w:val="4070a0"/>
+      <w:color w:val="4e9a06"/>
+      <w:shd w:val="clear" w:fill="f8f8f8"/>
     </w:rPr>
   </w:style>
   <w:style w:type="character" w:customStyle="1" w:styleId="VerbatimStringTok">
     <w:name w:val="VerbatimStringTok"/>
     <w:basedOn w:val="VerbatimChar"/>
     <w:rPr>
-      <w:color w:val="4070a0"/>
+      <w:color w:val="4e9a06"/>
+      <w:shd w:val="clear" w:fill="f8f8f8"/>
     </w:rPr>
   </w:style>
   <w:style w:type="character" w:customStyle="1" w:styleId="SpecialStringTok">
     <w:name w:val="SpecialStringTok"/>
     <w:basedOn w:val="VerbatimChar"/>
     <w:rPr>
-      <w:color w:val="bb6688"/>
+      <w:color w:val="4e9a06"/>
+      <w:shd w:val="clear" w:fill="f8f8f8"/>
     </w:rPr>
   </w:style>
   <w:style w:type="character" w:customStyle="1" w:styleId="ImportTok">
     <w:name w:val="ImportTok"/>
     <w:basedOn w:val="VerbatimChar"/>
     <w:rPr>
-      <w:b/>
-      <w:color w:val="008000"/>
+      <w:shd w:val="clear" w:fill="f8f8f8"/>
     </w:rPr>
   </w:style>
   <w:style w:type="character" w:customStyle="1" w:styleId="CommentTok">
@@ -2432,15 +2444,18 @@
     <w:basedOn w:val="VerbatimChar"/>
     <w:rPr>
       <w:i/>
-      <w:color w:val="60a0b0"/>
+      <w:color w:val="8f5902"/>
+      <w:shd w:val="clear" w:fill="f8f8f8"/>
     </w:rPr>
   </w:style>
   <w:style w:type="character" w:customStyle="1" w:styleId="DocumentationTok">
     <w:name w:val="DocumentationTok"/>
     <w:basedOn w:val="VerbatimChar"/>
     <w:rPr>
+      <w:b/>
       <w:i/>
-      <w:color w:val="ba2121"/>
+      <w:color w:val="8f5902"/>
+      <w:shd w:val="clear" w:fill="f8f8f8"/>
     </w:rPr>
   </w:style>
   <w:style w:type="character" w:customStyle="1" w:styleId="AnnotationTok">
@@ -2449,7 +2464,8 @@
     <w:rPr>
       <w:b/>
       <w:i/>
-      <w:color w:val="60a0b0"/>
+      <w:color w:val="8f5902"/>
+      <w:shd w:val="clear" w:fill="f8f8f8"/>
     </w:rPr>
   </w:style>
   <w:style w:type="character" w:customStyle="1" w:styleId="CommentVarTok">
@@ -2458,28 +2474,33 @@
     <w:rPr>
       <w:b/>
       <w:i/>
-      <w:color w:val="60a0b0"/>
+      <w:color w:val="8f5902"/>
+      <w:shd w:val="clear" w:fill="f8f8f8"/>
     </w:rPr>
   </w:style>
   <w:style w:type="character" w:customStyle="1" w:styleId="OtherTok">
     <w:name w:val="OtherTok"/>
     <w:basedOn w:val="VerbatimChar"/>
     <w:rPr>
-      <w:color w:val="007020"/>
+      <w:color w:val="8f5902"/>
+      <w:shd w:val="clear" w:fill="f8f8f8"/>
     </w:rPr>
   </w:style>
   <w:style w:type="character" w:customStyle="1" w:styleId="FunctionTok">
     <w:name w:val="FunctionTok"/>
     <w:basedOn w:val="VerbatimChar"/>
     <w:rPr>
-      <w:color w:val="06287e"/>
+      <w:b/>
+      <w:color w:val="204a87"/>
+      <w:shd w:val="clear" w:fill="f8f8f8"/>
     </w:rPr>
   </w:style>
   <w:style w:type="character" w:customStyle="1" w:styleId="VariableTok">
     <w:name w:val="VariableTok"/>
     <w:basedOn w:val="VerbatimChar"/>
     <w:rPr>
-      <w:color w:val="19177c"/>
+      <w:color w:val="000000"/>
+      <w:shd w:val="clear" w:fill="f8f8f8"/>
     </w:rPr>
   </w:style>
   <w:style w:type="character" w:customStyle="1" w:styleId="ControlFlowTok">
@@ -2487,46 +2508,56 @@
     <w:basedOn w:val="VerbatimChar"/>
     <w:rPr>
       <w:b/>
-      <w:color w:val="007020"/>
+      <w:color w:val="204a87"/>
+      <w:shd w:val="clear" w:fill="f8f8f8"/>
     </w:rPr>
   </w:style>
   <w:style w:type="character" w:customStyle="1" w:styleId="OperatorTok">
     <w:name w:val="OperatorTok"/>
     <w:basedOn w:val="VerbatimChar"/>
     <w:rPr>
-      <w:color w:val="666666"/>
+      <w:b/>
+      <w:color w:val="ce5c00"/>
+      <w:shd w:val="clear" w:fill="f8f8f8"/>
     </w:rPr>
   </w:style>
   <w:style w:type="character" w:customStyle="1" w:styleId="BuiltInTok">
     <w:name w:val="BuiltInTok"/>
     <w:basedOn w:val="VerbatimChar"/>
     <w:rPr>
-      <w:color w:val="008000"/>
+      <w:shd w:val="clear" w:fill="f8f8f8"/>
     </w:rPr>
   </w:style>
   <w:style w:type="character" w:customStyle="1" w:styleId="ExtensionTok">
     <w:name w:val="ExtensionTok"/>
     <w:basedOn w:val="VerbatimChar"/>
-    <w:rPr/>
+    <w:rPr>
+      <w:shd w:val="clear" w:fill="f8f8f8"/>
+    </w:rPr>
   </w:style>
   <w:style w:type="character" w:customStyle="1" w:styleId="PreprocessorTok">
     <w:name w:val="PreprocessorTok"/>
     <w:basedOn w:val="VerbatimChar"/>
     <w:rPr>
-      <w:color w:val="bc7a00"/>
+      <w:i/>
+      <w:color w:val="8f5902"/>
+      <w:shd w:val="clear" w:fill="f8f8f8"/>
     </w:rPr>
   </w:style>
   <w:style w:type="character" w:customStyle="1" w:styleId="AttributeTok">
     <w:name w:val="AttributeTok"/>
     <w:basedOn w:val="VerbatimChar"/>
     <w:rPr>
-      <w:color w:val="7d9029"/>
+      <w:color w:val="204a87"/>
+      <w:shd w:val="clear" w:fill="f8f8f8"/>
     </w:rPr>
   </w:style>
   <w:style w:type="character" w:customStyle="1" w:styleId="RegionMarkerTok">
     <w:name w:val="RegionMarkerTok"/>
     <w:basedOn w:val="VerbatimChar"/>
-    <w:rPr/>
+    <w:rPr>
+      <w:shd w:val="clear" w:fill="f8f8f8"/>
+    </w:rPr>
   </w:style>
   <w:style w:type="character" w:customStyle="1" w:styleId="InformationTok">
     <w:name w:val="InformationTok"/>
@@ -2534,7 +2565,8 @@
     <w:rPr>
       <w:b/>
       <w:i/>
-      <w:color w:val="60a0b0"/>
+      <w:color w:val="8f5902"/>
+      <w:shd w:val="clear" w:fill="f8f8f8"/>
     </w:rPr>
   </w:style>
   <w:style w:type="character" w:customStyle="1" w:styleId="WarningTok">
@@ -2543,15 +2575,16 @@
     <w:rPr>
       <w:b/>
       <w:i/>
-      <w:color w:val="60a0b0"/>
+      <w:color w:val="8f5902"/>
+      <w:shd w:val="clear" w:fill="f8f8f8"/>
     </w:rPr>
   </w:style>
   <w:style w:type="character" w:customStyle="1" w:styleId="AlertTok">
     <w:name w:val="AlertTok"/>
     <w:basedOn w:val="VerbatimChar"/>
     <w:rPr>
-      <w:b/>
-      <w:color w:val="ff0000"/>
+      <w:color w:val="ef2929"/>
+      <w:shd w:val="clear" w:fill="f8f8f8"/>
     </w:rPr>
   </w:style>
   <w:style w:type="character" w:customStyle="1" w:styleId="ErrorTok">
@@ -2559,13 +2592,16 @@
     <w:basedOn w:val="VerbatimChar"/>
     <w:rPr>
       <w:b/>
-      <w:color w:val="ff0000"/>
+      <w:color w:val="a40000"/>
+      <w:shd w:val="clear" w:fill="f8f8f8"/>
     </w:rPr>
   </w:style>
   <w:style w:type="character" w:customStyle="1" w:styleId="NormalTok">
     <w:name w:val="NormalTok"/>
     <w:basedOn w:val="VerbatimChar"/>
-    <w:rPr/>
+    <w:rPr>
+      <w:shd w:val="clear" w:fill="f8f8f8"/>
+    </w:rPr>
   </w:style>
 </w:styles>
 </file>

</xml_diff>

<commit_message>
content: add lesson plans for all 4 programming courses (51 topics)
- Algorithm (Coding Kids): 12 topics — Robot, Sequence, Maze, Loop, If/Then, Compare, Pattern, Classification, Optimize, Debug, Decompose, Final Project
- Scratch Kids: 12 topics — Intro, Motion, Events, Looks, Sound, Loop, If/Else, Variables, Coordinates, Clone, Full Game, Final Project
- Python Lab: 12 topics — Hello, Variables, If/Else, Loop, Function, List/Dict, Random/Game, Turtle, Files/CSV/JSON, AI/Chatbot, CV/QR, Final Project
- C++ Algorithm Lab: 15 topics — Getting Started through Graph/DP/Contest/Mock/Final

Each course: Markdown + DOCX versions. All seeded into database as lesson materials.
</commit_message>
<xml_diff>
--- a/content/algorithm/docx/topic-01-robot-va-lenh.docx
+++ b/content/algorithm/docx/topic-01-robot-va-lenh.docx
@@ -2339,7 +2339,6 @@
     <w:link w:val="VerbatimChar"/>
     <w:pPr>
       <w:wordWrap w:val="off"/>
-      <w:shd w:val="clear" w:fill="f8f8f8"/>
     </w:pPr>
   </w:style>
   <w:style w:type="character" w:customStyle="1" w:styleId="KeywordTok">
@@ -2347,96 +2346,85 @@
     <w:basedOn w:val="VerbatimChar"/>
     <w:rPr>
       <w:b/>
-      <w:color w:val="204a87"/>
-      <w:shd w:val="clear" w:fill="f8f8f8"/>
+      <w:color w:val="007020"/>
     </w:rPr>
   </w:style>
   <w:style w:type="character" w:customStyle="1" w:styleId="DataTypeTok">
     <w:name w:val="DataTypeTok"/>
     <w:basedOn w:val="VerbatimChar"/>
     <w:rPr>
-      <w:color w:val="204a87"/>
-      <w:shd w:val="clear" w:fill="f8f8f8"/>
+      <w:color w:val="902000"/>
     </w:rPr>
   </w:style>
   <w:style w:type="character" w:customStyle="1" w:styleId="DecValTok">
     <w:name w:val="DecValTok"/>
     <w:basedOn w:val="VerbatimChar"/>
     <w:rPr>
-      <w:color w:val="0000cf"/>
-      <w:shd w:val="clear" w:fill="f8f8f8"/>
+      <w:color w:val="40a070"/>
     </w:rPr>
   </w:style>
   <w:style w:type="character" w:customStyle="1" w:styleId="BaseNTok">
     <w:name w:val="BaseNTok"/>
     <w:basedOn w:val="VerbatimChar"/>
     <w:rPr>
-      <w:color w:val="0000cf"/>
-      <w:shd w:val="clear" w:fill="f8f8f8"/>
+      <w:color w:val="40a070"/>
     </w:rPr>
   </w:style>
   <w:style w:type="character" w:customStyle="1" w:styleId="FloatTok">
     <w:name w:val="FloatTok"/>
     <w:basedOn w:val="VerbatimChar"/>
     <w:rPr>
-      <w:color w:val="0000cf"/>
-      <w:shd w:val="clear" w:fill="f8f8f8"/>
+      <w:color w:val="40a070"/>
     </w:rPr>
   </w:style>
   <w:style w:type="character" w:customStyle="1" w:styleId="ConstantTok">
     <w:name w:val="ConstantTok"/>
     <w:basedOn w:val="VerbatimChar"/>
     <w:rPr>
-      <w:color w:val="8f5902"/>
-      <w:shd w:val="clear" w:fill="f8f8f8"/>
+      <w:color w:val="880000"/>
     </w:rPr>
   </w:style>
   <w:style w:type="character" w:customStyle="1" w:styleId="CharTok">
     <w:name w:val="CharTok"/>
     <w:basedOn w:val="VerbatimChar"/>
     <w:rPr>
-      <w:color w:val="4e9a06"/>
-      <w:shd w:val="clear" w:fill="f8f8f8"/>
+      <w:color w:val="4070a0"/>
     </w:rPr>
   </w:style>
   <w:style w:type="character" w:customStyle="1" w:styleId="SpecialCharTok">
     <w:name w:val="SpecialCharTok"/>
     <w:basedOn w:val="VerbatimChar"/>
     <w:rPr>
-      <w:b/>
-      <w:color w:val="ce5c00"/>
-      <w:shd w:val="clear" w:fill="f8f8f8"/>
+      <w:color w:val="4070a0"/>
     </w:rPr>
   </w:style>
   <w:style w:type="character" w:customStyle="1" w:styleId="StringTok">
     <w:name w:val="StringTok"/>
     <w:basedOn w:val="VerbatimChar"/>
     <w:rPr>
-      <w:color w:val="4e9a06"/>
-      <w:shd w:val="clear" w:fill="f8f8f8"/>
+      <w:color w:val="4070a0"/>
     </w:rPr>
   </w:style>
   <w:style w:type="character" w:customStyle="1" w:styleId="VerbatimStringTok">
     <w:name w:val="VerbatimStringTok"/>
     <w:basedOn w:val="VerbatimChar"/>
     <w:rPr>
-      <w:color w:val="4e9a06"/>
-      <w:shd w:val="clear" w:fill="f8f8f8"/>
+      <w:color w:val="4070a0"/>
     </w:rPr>
   </w:style>
   <w:style w:type="character" w:customStyle="1" w:styleId="SpecialStringTok">
     <w:name w:val="SpecialStringTok"/>
     <w:basedOn w:val="VerbatimChar"/>
     <w:rPr>
-      <w:color w:val="4e9a06"/>
-      <w:shd w:val="clear" w:fill="f8f8f8"/>
+      <w:color w:val="bb6688"/>
     </w:rPr>
   </w:style>
   <w:style w:type="character" w:customStyle="1" w:styleId="ImportTok">
     <w:name w:val="ImportTok"/>
     <w:basedOn w:val="VerbatimChar"/>
     <w:rPr>
-      <w:shd w:val="clear" w:fill="f8f8f8"/>
+      <w:b/>
+      <w:color w:val="008000"/>
     </w:rPr>
   </w:style>
   <w:style w:type="character" w:customStyle="1" w:styleId="CommentTok">
@@ -2444,147 +2432,126 @@
     <w:basedOn w:val="VerbatimChar"/>
     <w:rPr>
       <w:i/>
-      <w:color w:val="8f5902"/>
-      <w:shd w:val="clear" w:fill="f8f8f8"/>
+      <w:color w:val="60a0b0"/>
     </w:rPr>
   </w:style>
   <w:style w:type="character" w:customStyle="1" w:styleId="DocumentationTok">
     <w:name w:val="DocumentationTok"/>
     <w:basedOn w:val="VerbatimChar"/>
     <w:rPr>
+      <w:i/>
+      <w:color w:val="ba2121"/>
+    </w:rPr>
+  </w:style>
+  <w:style w:type="character" w:customStyle="1" w:styleId="AnnotationTok">
+    <w:name w:val="AnnotationTok"/>
+    <w:basedOn w:val="VerbatimChar"/>
+    <w:rPr>
       <w:b/>
       <w:i/>
-      <w:color w:val="8f5902"/>
-      <w:shd w:val="clear" w:fill="f8f8f8"/>
-    </w:rPr>
-  </w:style>
-  <w:style w:type="character" w:customStyle="1" w:styleId="AnnotationTok">
-    <w:name w:val="AnnotationTok"/>
+      <w:color w:val="60a0b0"/>
+    </w:rPr>
+  </w:style>
+  <w:style w:type="character" w:customStyle="1" w:styleId="CommentVarTok">
+    <w:name w:val="CommentVarTok"/>
     <w:basedOn w:val="VerbatimChar"/>
     <w:rPr>
       <w:b/>
       <w:i/>
-      <w:color w:val="8f5902"/>
-      <w:shd w:val="clear" w:fill="f8f8f8"/>
-    </w:rPr>
-  </w:style>
-  <w:style w:type="character" w:customStyle="1" w:styleId="CommentVarTok">
-    <w:name w:val="CommentVarTok"/>
+      <w:color w:val="60a0b0"/>
+    </w:rPr>
+  </w:style>
+  <w:style w:type="character" w:customStyle="1" w:styleId="OtherTok">
+    <w:name w:val="OtherTok"/>
+    <w:basedOn w:val="VerbatimChar"/>
+    <w:rPr>
+      <w:color w:val="007020"/>
+    </w:rPr>
+  </w:style>
+  <w:style w:type="character" w:customStyle="1" w:styleId="FunctionTok">
+    <w:name w:val="FunctionTok"/>
+    <w:basedOn w:val="VerbatimChar"/>
+    <w:rPr>
+      <w:color w:val="06287e"/>
+    </w:rPr>
+  </w:style>
+  <w:style w:type="character" w:customStyle="1" w:styleId="VariableTok">
+    <w:name w:val="VariableTok"/>
+    <w:basedOn w:val="VerbatimChar"/>
+    <w:rPr>
+      <w:color w:val="19177c"/>
+    </w:rPr>
+  </w:style>
+  <w:style w:type="character" w:customStyle="1" w:styleId="ControlFlowTok">
+    <w:name w:val="ControlFlowTok"/>
+    <w:basedOn w:val="VerbatimChar"/>
+    <w:rPr>
+      <w:b/>
+      <w:color w:val="007020"/>
+    </w:rPr>
+  </w:style>
+  <w:style w:type="character" w:customStyle="1" w:styleId="OperatorTok">
+    <w:name w:val="OperatorTok"/>
+    <w:basedOn w:val="VerbatimChar"/>
+    <w:rPr>
+      <w:color w:val="666666"/>
+    </w:rPr>
+  </w:style>
+  <w:style w:type="character" w:customStyle="1" w:styleId="BuiltInTok">
+    <w:name w:val="BuiltInTok"/>
+    <w:basedOn w:val="VerbatimChar"/>
+    <w:rPr>
+      <w:color w:val="008000"/>
+    </w:rPr>
+  </w:style>
+  <w:style w:type="character" w:customStyle="1" w:styleId="ExtensionTok">
+    <w:name w:val="ExtensionTok"/>
+    <w:basedOn w:val="VerbatimChar"/>
+    <w:rPr/>
+  </w:style>
+  <w:style w:type="character" w:customStyle="1" w:styleId="PreprocessorTok">
+    <w:name w:val="PreprocessorTok"/>
+    <w:basedOn w:val="VerbatimChar"/>
+    <w:rPr>
+      <w:color w:val="bc7a00"/>
+    </w:rPr>
+  </w:style>
+  <w:style w:type="character" w:customStyle="1" w:styleId="AttributeTok">
+    <w:name w:val="AttributeTok"/>
+    <w:basedOn w:val="VerbatimChar"/>
+    <w:rPr>
+      <w:color w:val="7d9029"/>
+    </w:rPr>
+  </w:style>
+  <w:style w:type="character" w:customStyle="1" w:styleId="RegionMarkerTok">
+    <w:name w:val="RegionMarkerTok"/>
+    <w:basedOn w:val="VerbatimChar"/>
+    <w:rPr/>
+  </w:style>
+  <w:style w:type="character" w:customStyle="1" w:styleId="InformationTok">
+    <w:name w:val="InformationTok"/>
     <w:basedOn w:val="VerbatimChar"/>
     <w:rPr>
       <w:b/>
       <w:i/>
-      <w:color w:val="8f5902"/>
-      <w:shd w:val="clear" w:fill="f8f8f8"/>
-    </w:rPr>
-  </w:style>
-  <w:style w:type="character" w:customStyle="1" w:styleId="OtherTok">
-    <w:name w:val="OtherTok"/>
-    <w:basedOn w:val="VerbatimChar"/>
-    <w:rPr>
-      <w:color w:val="8f5902"/>
-      <w:shd w:val="clear" w:fill="f8f8f8"/>
-    </w:rPr>
-  </w:style>
-  <w:style w:type="character" w:customStyle="1" w:styleId="FunctionTok">
-    <w:name w:val="FunctionTok"/>
-    <w:basedOn w:val="VerbatimChar"/>
-    <w:rPr>
-      <w:b/>
-      <w:color w:val="204a87"/>
-      <w:shd w:val="clear" w:fill="f8f8f8"/>
-    </w:rPr>
-  </w:style>
-  <w:style w:type="character" w:customStyle="1" w:styleId="VariableTok">
-    <w:name w:val="VariableTok"/>
-    <w:basedOn w:val="VerbatimChar"/>
-    <w:rPr>
-      <w:color w:val="000000"/>
-      <w:shd w:val="clear" w:fill="f8f8f8"/>
-    </w:rPr>
-  </w:style>
-  <w:style w:type="character" w:customStyle="1" w:styleId="ControlFlowTok">
-    <w:name w:val="ControlFlowTok"/>
-    <w:basedOn w:val="VerbatimChar"/>
-    <w:rPr>
-      <w:b/>
-      <w:color w:val="204a87"/>
-      <w:shd w:val="clear" w:fill="f8f8f8"/>
-    </w:rPr>
-  </w:style>
-  <w:style w:type="character" w:customStyle="1" w:styleId="OperatorTok">
-    <w:name w:val="OperatorTok"/>
-    <w:basedOn w:val="VerbatimChar"/>
-    <w:rPr>
-      <w:b/>
-      <w:color w:val="ce5c00"/>
-      <w:shd w:val="clear" w:fill="f8f8f8"/>
-    </w:rPr>
-  </w:style>
-  <w:style w:type="character" w:customStyle="1" w:styleId="BuiltInTok">
-    <w:name w:val="BuiltInTok"/>
-    <w:basedOn w:val="VerbatimChar"/>
-    <w:rPr>
-      <w:shd w:val="clear" w:fill="f8f8f8"/>
-    </w:rPr>
-  </w:style>
-  <w:style w:type="character" w:customStyle="1" w:styleId="ExtensionTok">
-    <w:name w:val="ExtensionTok"/>
-    <w:basedOn w:val="VerbatimChar"/>
-    <w:rPr>
-      <w:shd w:val="clear" w:fill="f8f8f8"/>
-    </w:rPr>
-  </w:style>
-  <w:style w:type="character" w:customStyle="1" w:styleId="PreprocessorTok">
-    <w:name w:val="PreprocessorTok"/>
-    <w:basedOn w:val="VerbatimChar"/>
-    <w:rPr>
-      <w:i/>
-      <w:color w:val="8f5902"/>
-      <w:shd w:val="clear" w:fill="f8f8f8"/>
-    </w:rPr>
-  </w:style>
-  <w:style w:type="character" w:customStyle="1" w:styleId="AttributeTok">
-    <w:name w:val="AttributeTok"/>
-    <w:basedOn w:val="VerbatimChar"/>
-    <w:rPr>
-      <w:color w:val="204a87"/>
-      <w:shd w:val="clear" w:fill="f8f8f8"/>
-    </w:rPr>
-  </w:style>
-  <w:style w:type="character" w:customStyle="1" w:styleId="RegionMarkerTok">
-    <w:name w:val="RegionMarkerTok"/>
-    <w:basedOn w:val="VerbatimChar"/>
-    <w:rPr>
-      <w:shd w:val="clear" w:fill="f8f8f8"/>
-    </w:rPr>
-  </w:style>
-  <w:style w:type="character" w:customStyle="1" w:styleId="InformationTok">
-    <w:name w:val="InformationTok"/>
+      <w:color w:val="60a0b0"/>
+    </w:rPr>
+  </w:style>
+  <w:style w:type="character" w:customStyle="1" w:styleId="WarningTok">
+    <w:name w:val="WarningTok"/>
     <w:basedOn w:val="VerbatimChar"/>
     <w:rPr>
       <w:b/>
       <w:i/>
-      <w:color w:val="8f5902"/>
-      <w:shd w:val="clear" w:fill="f8f8f8"/>
-    </w:rPr>
-  </w:style>
-  <w:style w:type="character" w:customStyle="1" w:styleId="WarningTok">
-    <w:name w:val="WarningTok"/>
-    <w:basedOn w:val="VerbatimChar"/>
-    <w:rPr>
-      <w:b/>
-      <w:i/>
-      <w:color w:val="8f5902"/>
-      <w:shd w:val="clear" w:fill="f8f8f8"/>
+      <w:color w:val="60a0b0"/>
     </w:rPr>
   </w:style>
   <w:style w:type="character" w:customStyle="1" w:styleId="AlertTok">
     <w:name w:val="AlertTok"/>
     <w:basedOn w:val="VerbatimChar"/>
     <w:rPr>
-      <w:color w:val="ef2929"/>
-      <w:shd w:val="clear" w:fill="f8f8f8"/>
+      <w:b/>
+      <w:color w:val="ff0000"/>
     </w:rPr>
   </w:style>
   <w:style w:type="character" w:customStyle="1" w:styleId="ErrorTok">
@@ -2592,16 +2559,13 @@
     <w:basedOn w:val="VerbatimChar"/>
     <w:rPr>
       <w:b/>
-      <w:color w:val="a40000"/>
-      <w:shd w:val="clear" w:fill="f8f8f8"/>
+      <w:color w:val="ff0000"/>
     </w:rPr>
   </w:style>
   <w:style w:type="character" w:customStyle="1" w:styleId="NormalTok">
     <w:name w:val="NormalTok"/>
     <w:basedOn w:val="VerbatimChar"/>
-    <w:rPr>
-      <w:shd w:val="clear" w:fill="f8f8f8"/>
-    </w:rPr>
+    <w:rPr/>
   </w:style>
 </w:styles>
 </file>

</xml_diff>